<commit_message>
User guide: make charts and tables full page width
Co-Authored-By: Claude Sonnet 5.5 <noreply@anthropic.com>
Claude-Session: https://claude.ai/code/session_019dELNUNjVMr3Ja2mUwBrCu
</commit_message>
<xml_diff>
--- a/docs/user-guide/en/ManFoods_Portal_Guide_EN.docx
+++ b/docs/user-guide/en/ManFoods_Portal_Guide_EN.docx
@@ -729,7 +729,7 @@
       <w:r>
         <w:drawing>
           <wp:inline distT="0" distB="0" distL="0" distR="0">
-            <wp:extent cx="4000500" cy="2286000"/>
+            <wp:extent cx="5715000" cy="3257550"/>
             <wp:effectExtent t="0" r="0" b="0" l="0"/>
             <wp:docPr id="7" name="" descr="" title=""/>
             <wp:cNvGraphicFramePr>
@@ -754,7 +754,7 @@
                   <pic:spPr bwMode="auto">
                     <a:xfrm>
                       <a:off x="0" y="0"/>
-                      <a:ext cx="4000500" cy="2286000"/>
+                      <a:ext cx="5715000" cy="3257550"/>
                     </a:xfrm>
                     <a:prstGeom prst="rect">
                       <a:avLst/>
@@ -834,7 +834,7 @@
       <w:r>
         <w:drawing>
           <wp:inline distT="0" distB="0" distL="0" distR="0">
-            <wp:extent cx="4000500" cy="2286000"/>
+            <wp:extent cx="5715000" cy="3257550"/>
             <wp:effectExtent t="0" r="0" b="0" l="0"/>
             <wp:docPr id="8" name="" descr="" title=""/>
             <wp:cNvGraphicFramePr>
@@ -859,7 +859,7 @@
                   <pic:spPr bwMode="auto">
                     <a:xfrm>
                       <a:off x="0" y="0"/>
-                      <a:ext cx="4000500" cy="2286000"/>
+                      <a:ext cx="5715000" cy="3257550"/>
                     </a:xfrm>
                     <a:prstGeom prst="rect">
                       <a:avLst/>
@@ -906,7 +906,7 @@
       <w:r>
         <w:drawing>
           <wp:inline distT="0" distB="0" distL="0" distR="0">
-            <wp:extent cx="4000500" cy="2286000"/>
+            <wp:extent cx="5715000" cy="3257550"/>
             <wp:effectExtent t="0" r="0" b="0" l="0"/>
             <wp:docPr id="9" name="" descr="" title=""/>
             <wp:cNvGraphicFramePr>
@@ -931,7 +931,7 @@
                   <pic:spPr bwMode="auto">
                     <a:xfrm>
                       <a:off x="0" y="0"/>
-                      <a:ext cx="4000500" cy="2286000"/>
+                      <a:ext cx="5715000" cy="3257550"/>
                     </a:xfrm>
                     <a:prstGeom prst="rect">
                       <a:avLst/>
@@ -978,7 +978,7 @@
       <w:r>
         <w:drawing>
           <wp:inline distT="0" distB="0" distL="0" distR="0">
-            <wp:extent cx="4000500" cy="2286000"/>
+            <wp:extent cx="5715000" cy="3257550"/>
             <wp:effectExtent t="0" r="0" b="0" l="0"/>
             <wp:docPr id="10" name="" descr="" title=""/>
             <wp:cNvGraphicFramePr>
@@ -1003,7 +1003,7 @@
                   <pic:spPr bwMode="auto">
                     <a:xfrm>
                       <a:off x="0" y="0"/>
-                      <a:ext cx="4000500" cy="2286000"/>
+                      <a:ext cx="5715000" cy="3257550"/>
                     </a:xfrm>
                     <a:prstGeom prst="rect">
                       <a:avLst/>
@@ -1163,7 +1163,7 @@
       <w:r>
         <w:drawing>
           <wp:inline distT="0" distB="0" distL="0" distR="0">
-            <wp:extent cx="4000500" cy="3667125"/>
+            <wp:extent cx="5715000" cy="5238750"/>
             <wp:effectExtent t="0" r="0" b="0" l="0"/>
             <wp:docPr id="12" name="" descr="" title=""/>
             <wp:cNvGraphicFramePr>
@@ -1188,7 +1188,7 @@
                   <pic:spPr bwMode="auto">
                     <a:xfrm>
                       <a:off x="0" y="0"/>
-                      <a:ext cx="4000500" cy="3667125"/>
+                      <a:ext cx="5715000" cy="5238750"/>
                     </a:xfrm>
                     <a:prstGeom prst="rect">
                       <a:avLst/>
@@ -1210,7 +1210,7 @@
       <w:r>
         <w:drawing>
           <wp:inline distT="0" distB="0" distL="0" distR="0">
-            <wp:extent cx="4000500" cy="1114425"/>
+            <wp:extent cx="5715000" cy="1600200"/>
             <wp:effectExtent t="0" r="0" b="0" l="0"/>
             <wp:docPr id="13" name="" descr="" title=""/>
             <wp:cNvGraphicFramePr>
@@ -1235,7 +1235,7 @@
                   <pic:spPr bwMode="auto">
                     <a:xfrm>
                       <a:off x="0" y="0"/>
-                      <a:ext cx="4000500" cy="1114425"/>
+                      <a:ext cx="5715000" cy="1600200"/>
                     </a:xfrm>
                     <a:prstGeom prst="rect">
                       <a:avLst/>
@@ -1257,7 +1257,7 @@
       <w:r>
         <w:drawing>
           <wp:inline distT="0" distB="0" distL="0" distR="0">
-            <wp:extent cx="4000500" cy="1114425"/>
+            <wp:extent cx="5715000" cy="1600200"/>
             <wp:effectExtent t="0" r="0" b="0" l="0"/>
             <wp:docPr id="14" name="" descr="" title=""/>
             <wp:cNvGraphicFramePr>
@@ -1282,7 +1282,7 @@
                   <pic:spPr bwMode="auto">
                     <a:xfrm>
                       <a:off x="0" y="0"/>
-                      <a:ext cx="4000500" cy="1114425"/>
+                      <a:ext cx="5715000" cy="1600200"/>
                     </a:xfrm>
                     <a:prstGeom prst="rect">
                       <a:avLst/>
@@ -1304,7 +1304,7 @@
       <w:r>
         <w:drawing>
           <wp:inline distT="0" distB="0" distL="0" distR="0">
-            <wp:extent cx="4000500" cy="1333500"/>
+            <wp:extent cx="5715000" cy="1905000"/>
             <wp:effectExtent t="0" r="0" b="0" l="0"/>
             <wp:docPr id="15" name="" descr="" title=""/>
             <wp:cNvGraphicFramePr>
@@ -1329,7 +1329,7 @@
                   <pic:spPr bwMode="auto">
                     <a:xfrm>
                       <a:off x="0" y="0"/>
-                      <a:ext cx="4000500" cy="1333500"/>
+                      <a:ext cx="5715000" cy="1905000"/>
                     </a:xfrm>
                     <a:prstGeom prst="rect">
                       <a:avLst/>
@@ -2812,7 +2812,7 @@
       <w:r>
         <w:drawing>
           <wp:inline distT="0" distB="0" distL="0" distR="0">
-            <wp:extent cx="4000500" cy="2886075"/>
+            <wp:extent cx="5715000" cy="4124325"/>
             <wp:effectExtent t="0" r="0" b="0" l="0"/>
             <wp:docPr id="26" name="" descr="" title=""/>
             <wp:cNvGraphicFramePr>
@@ -2837,7 +2837,7 @@
                   <pic:spPr bwMode="auto">
                     <a:xfrm>
                       <a:off x="0" y="0"/>
-                      <a:ext cx="4000500" cy="2886075"/>
+                      <a:ext cx="5715000" cy="4124325"/>
                     </a:xfrm>
                     <a:prstGeom prst="rect">
                       <a:avLst/>
@@ -2859,7 +2859,7 @@
       <w:r>
         <w:drawing>
           <wp:inline distT="0" distB="0" distL="0" distR="0">
-            <wp:extent cx="4000500" cy="2047875"/>
+            <wp:extent cx="5715000" cy="2924175"/>
             <wp:effectExtent t="0" r="0" b="0" l="0"/>
             <wp:docPr id="27" name="" descr="" title=""/>
             <wp:cNvGraphicFramePr>
@@ -2884,7 +2884,7 @@
                   <pic:spPr bwMode="auto">
                     <a:xfrm>
                       <a:off x="0" y="0"/>
-                      <a:ext cx="4000500" cy="2047875"/>
+                      <a:ext cx="5715000" cy="2924175"/>
                     </a:xfrm>
                     <a:prstGeom prst="rect">
                       <a:avLst/>
@@ -3463,7 +3463,7 @@
       <w:r>
         <w:drawing>
           <wp:inline distT="0" distB="0" distL="0" distR="0">
-            <wp:extent cx="4953000" cy="1943100"/>
+            <wp:extent cx="5715000" cy="2247900"/>
             <wp:effectExtent t="0" r="0" b="0" l="0"/>
             <wp:docPr id="30" name="" descr="" title=""/>
             <wp:cNvGraphicFramePr>
@@ -3488,7 +3488,7 @@
                   <pic:spPr bwMode="auto">
                     <a:xfrm>
                       <a:off x="0" y="0"/>
-                      <a:ext cx="4953000" cy="1943100"/>
+                      <a:ext cx="5715000" cy="2247900"/>
                     </a:xfrm>
                     <a:prstGeom prst="rect">
                       <a:avLst/>
@@ -3510,7 +3510,7 @@
       <w:r>
         <w:drawing>
           <wp:inline distT="0" distB="0" distL="0" distR="0">
-            <wp:extent cx="4953000" cy="800100"/>
+            <wp:extent cx="5715000" cy="923925"/>
             <wp:effectExtent t="0" r="0" b="0" l="0"/>
             <wp:docPr id="31" name="" descr="" title=""/>
             <wp:cNvGraphicFramePr>
@@ -3535,7 +3535,7 @@
                   <pic:spPr bwMode="auto">
                     <a:xfrm>
                       <a:off x="0" y="0"/>
-                      <a:ext cx="4953000" cy="800100"/>
+                      <a:ext cx="5715000" cy="923925"/>
                     </a:xfrm>
                     <a:prstGeom prst="rect">
                       <a:avLst/>
@@ -3557,7 +3557,7 @@
       <w:r>
         <w:drawing>
           <wp:inline distT="0" distB="0" distL="0" distR="0">
-            <wp:extent cx="4953000" cy="800100"/>
+            <wp:extent cx="5715000" cy="923925"/>
             <wp:effectExtent t="0" r="0" b="0" l="0"/>
             <wp:docPr id="32" name="" descr="" title=""/>
             <wp:cNvGraphicFramePr>
@@ -3582,7 +3582,7 @@
                   <pic:spPr bwMode="auto">
                     <a:xfrm>
                       <a:off x="0" y="0"/>
-                      <a:ext cx="4953000" cy="800100"/>
+                      <a:ext cx="5715000" cy="923925"/>
                     </a:xfrm>
                     <a:prstGeom prst="rect">
                       <a:avLst/>
@@ -3604,7 +3604,7 @@
       <w:r>
         <w:drawing>
           <wp:inline distT="0" distB="0" distL="0" distR="0">
-            <wp:extent cx="4953000" cy="1209675"/>
+            <wp:extent cx="5715000" cy="1400175"/>
             <wp:effectExtent t="0" r="0" b="0" l="0"/>
             <wp:docPr id="33" name="" descr="" title=""/>
             <wp:cNvGraphicFramePr>
@@ -3629,7 +3629,7 @@
                   <pic:spPr bwMode="auto">
                     <a:xfrm>
                       <a:off x="0" y="0"/>
-                      <a:ext cx="4953000" cy="1209675"/>
+                      <a:ext cx="5715000" cy="1400175"/>
                     </a:xfrm>
                     <a:prstGeom prst="rect">
                       <a:avLst/>
@@ -5335,7 +5335,7 @@
       <w:r>
         <w:drawing>
           <wp:inline distT="0" distB="0" distL="0" distR="0">
-            <wp:extent cx="4953000" cy="2171700"/>
+            <wp:extent cx="5715000" cy="2505075"/>
             <wp:effectExtent t="0" r="0" b="0" l="0"/>
             <wp:docPr id="43" name="" descr="" title=""/>
             <wp:cNvGraphicFramePr>
@@ -5360,7 +5360,7 @@
                   <pic:spPr bwMode="auto">
                     <a:xfrm>
                       <a:off x="0" y="0"/>
-                      <a:ext cx="4953000" cy="2171700"/>
+                      <a:ext cx="5715000" cy="2505075"/>
                     </a:xfrm>
                     <a:prstGeom prst="rect">
                       <a:avLst/>
@@ -5382,7 +5382,7 @@
       <w:r>
         <w:drawing>
           <wp:inline distT="0" distB="0" distL="0" distR="0">
-            <wp:extent cx="4953000" cy="933450"/>
+            <wp:extent cx="5715000" cy="1076325"/>
             <wp:effectExtent t="0" r="0" b="0" l="0"/>
             <wp:docPr id="44" name="" descr="" title=""/>
             <wp:cNvGraphicFramePr>
@@ -5407,7 +5407,7 @@
                   <pic:spPr bwMode="auto">
                     <a:xfrm>
                       <a:off x="0" y="0"/>
-                      <a:ext cx="4953000" cy="933450"/>
+                      <a:ext cx="5715000" cy="1076325"/>
                     </a:xfrm>
                     <a:prstGeom prst="rect">
                       <a:avLst/>
@@ -5429,7 +5429,7 @@
       <w:r>
         <w:drawing>
           <wp:inline distT="0" distB="0" distL="0" distR="0">
-            <wp:extent cx="4953000" cy="933450"/>
+            <wp:extent cx="5715000" cy="1076325"/>
             <wp:effectExtent t="0" r="0" b="0" l="0"/>
             <wp:docPr id="45" name="" descr="" title=""/>
             <wp:cNvGraphicFramePr>
@@ -5454,7 +5454,7 @@
                   <pic:spPr bwMode="auto">
                     <a:xfrm>
                       <a:off x="0" y="0"/>
-                      <a:ext cx="4953000" cy="933450"/>
+                      <a:ext cx="5715000" cy="1076325"/>
                     </a:xfrm>
                     <a:prstGeom prst="rect">
                       <a:avLst/>
@@ -5476,7 +5476,7 @@
       <w:r>
         <w:drawing>
           <wp:inline distT="0" distB="0" distL="0" distR="0">
-            <wp:extent cx="4953000" cy="1085850"/>
+            <wp:extent cx="5715000" cy="1247775"/>
             <wp:effectExtent t="0" r="0" b="0" l="0"/>
             <wp:docPr id="46" name="" descr="" title=""/>
             <wp:cNvGraphicFramePr>
@@ -5501,7 +5501,7 @@
                   <pic:spPr bwMode="auto">
                     <a:xfrm>
                       <a:off x="0" y="0"/>
-                      <a:ext cx="4953000" cy="1085850"/>
+                      <a:ext cx="5715000" cy="1247775"/>
                     </a:xfrm>
                     <a:prstGeom prst="rect">
                       <a:avLst/>

</xml_diff>